<commit_message>
Labs 6 weы added to git
</commit_message>
<xml_diff>
--- a/Semester_2/Lab6/03_ПМИ_23_о_ИИАД_РудинРР_ЛР6_30-04-2026.docx
+++ b/Semester_2/Lab6/03_ПМИ_23_о_ИИАД_РудинРР_ЛР6_30-04-2026.docx
@@ -6,16 +6,82 @@
       <w:pPr>
         <w:jc w:val="center"/>
         <w:rPr>
-          <w:sz w:val="40"/>
-          <w:szCs w:val="40"/>
+          <w:sz w:val="44"/>
+          <w:szCs w:val="44"/>
+          <w:lang w:val="en-US"/>
         </w:rPr>
       </w:pPr>
-      <w:r>
-        <w:rPr>
-          <w:sz w:val="40"/>
-          <w:szCs w:val="40"/>
-        </w:rPr>
-        <w:t>Добавление ограничений:</w:t>
+      <w:proofErr w:type="spellStart"/>
+      <w:r>
+        <w:rPr>
+          <w:sz w:val="44"/>
+          <w:szCs w:val="44"/>
+          <w:lang w:val="en-US"/>
+        </w:rPr>
+        <w:t>Лабораторная</w:t>
+      </w:r>
+      <w:proofErr w:type="spellEnd"/>
+      <w:r>
+        <w:rPr>
+          <w:sz w:val="44"/>
+          <w:szCs w:val="44"/>
+          <w:lang w:val="en-US"/>
+        </w:rPr>
+        <w:t xml:space="preserve"> </w:t>
+      </w:r>
+      <w:proofErr w:type="spellStart"/>
+      <w:r>
+        <w:rPr>
+          <w:sz w:val="44"/>
+          <w:szCs w:val="44"/>
+          <w:lang w:val="en-US"/>
+        </w:rPr>
+        <w:t>работа</w:t>
+      </w:r>
+      <w:proofErr w:type="spellEnd"/>
+      <w:r>
+        <w:rPr>
+          <w:sz w:val="44"/>
+          <w:szCs w:val="44"/>
+          <w:lang w:val="en-US"/>
+        </w:rPr>
+        <w:t xml:space="preserve"> </w:t>
+      </w:r>
+      <w:proofErr w:type="spellStart"/>
+      <w:r>
+        <w:rPr>
+          <w:sz w:val="44"/>
+          <w:szCs w:val="44"/>
+          <w:lang w:val="en-US"/>
+        </w:rPr>
+        <w:t>по</w:t>
+      </w:r>
+      <w:proofErr w:type="spellEnd"/>
+      <w:r>
+        <w:rPr>
+          <w:sz w:val="44"/>
+          <w:szCs w:val="44"/>
+          <w:lang w:val="en-US"/>
+        </w:rPr>
+        <w:t xml:space="preserve"> </w:t>
+      </w:r>
+      <w:proofErr w:type="spellStart"/>
+      <w:r>
+        <w:rPr>
+          <w:sz w:val="44"/>
+          <w:szCs w:val="44"/>
+          <w:lang w:val="en-US"/>
+        </w:rPr>
+        <w:t>представлениям</w:t>
+      </w:r>
+      <w:proofErr w:type="spellEnd"/>
+      <w:r>
+        <w:rPr>
+          <w:sz w:val="44"/>
+          <w:szCs w:val="44"/>
+          <w:lang w:val="en-US"/>
+        </w:rPr>
+        <w:t>:</w:t>
       </w:r>
     </w:p>
     <w:p>
@@ -26,12 +92,12 @@
       </w:pPr>
       <w:r>
         <w:rPr>
-          <w:noProof/>
+          <w:lang w:val="en-US"/>
         </w:rPr>
         <w:drawing>
-          <wp:inline distT="0" distB="0" distL="0" distR="0" wp14:anchorId="78A2C1F1" wp14:editId="7F15C581">
-            <wp:extent cx="5940425" cy="6775450"/>
-            <wp:effectExtent l="0" t="0" r="3175" b="6350"/>
+          <wp:inline distT="0" distB="0" distL="0" distR="0" wp14:anchorId="679CB227" wp14:editId="0A1C47B3">
+            <wp:extent cx="5940425" cy="4740275"/>
+            <wp:effectExtent l="0" t="0" r="3175" b="3175"/>
             <wp:docPr id="1" name="Рисунок 1"/>
             <wp:cNvGraphicFramePr>
               <a:graphicFrameLocks xmlns:a="http://schemas.openxmlformats.org/drawingml/2006/main" noChangeAspect="1"/>
@@ -52,7 +118,7 @@
                   <pic:spPr>
                     <a:xfrm>
                       <a:off x="0" y="0"/>
-                      <a:ext cx="5940425" cy="6775450"/>
+                      <a:ext cx="5940425" cy="4740275"/>
                     </a:xfrm>
                     <a:prstGeom prst="rect">
                       <a:avLst/>
@@ -67,35 +133,20 @@
     </w:p>
     <w:p>
       <w:pPr>
-        <w:jc w:val="center"/>
         <w:rPr>
           <w:lang w:val="en-US"/>
         </w:rPr>
       </w:pPr>
       <w:r>
         <w:rPr>
-          <w:sz w:val="40"/>
-          <w:szCs w:val="40"/>
+          <w:lang w:val="en-US"/>
         </w:rPr>
         <w:lastRenderedPageBreak/>
-        <w:t>Проверки:</w:t>
-      </w:r>
-      <w:r>
-        <w:rPr>
-          <w:lang w:val="en-US"/>
-        </w:rPr>
-        <w:br/>
-      </w:r>
-      <w:r>
-        <w:rPr>
-          <w:noProof/>
-          <w:lang w:val="en-US"/>
-        </w:rPr>
         <w:drawing>
-          <wp:inline distT="0" distB="0" distL="0" distR="0" wp14:anchorId="001C5A72" wp14:editId="38760193">
-            <wp:extent cx="5940425" cy="2001520"/>
-            <wp:effectExtent l="0" t="0" r="3175" b="0"/>
-            <wp:docPr id="2" name="Рисунок 2"/>
+          <wp:inline distT="0" distB="0" distL="0" distR="0" wp14:anchorId="660ABDC7" wp14:editId="595F90BE">
+            <wp:extent cx="5940425" cy="3310255"/>
+            <wp:effectExtent l="0" t="0" r="3175" b="4445"/>
+            <wp:docPr id="13" name="Рисунок 13"/>
             <wp:cNvGraphicFramePr>
               <a:graphicFrameLocks xmlns:a="http://schemas.openxmlformats.org/drawingml/2006/main" noChangeAspect="1"/>
             </wp:cNvGraphicFramePr>
@@ -115,7 +166,7 @@
                   <pic:spPr>
                     <a:xfrm>
                       <a:off x="0" y="0"/>
-                      <a:ext cx="5940425" cy="2001520"/>
+                      <a:ext cx="5940425" cy="3310255"/>
                     </a:xfrm>
                     <a:prstGeom prst="rect">
                       <a:avLst/>
@@ -127,18 +178,15 @@
           </wp:inline>
         </w:drawing>
       </w:r>
-    </w:p>
-    <w:p>
-      <w:r>
-        <w:rPr>
-          <w:noProof/>
+      <w:r>
+        <w:rPr>
           <w:lang w:val="en-US"/>
         </w:rPr>
         <w:drawing>
-          <wp:inline distT="0" distB="0" distL="0" distR="0" wp14:anchorId="0837FF6B" wp14:editId="576267AD">
-            <wp:extent cx="5940425" cy="1483360"/>
-            <wp:effectExtent l="0" t="0" r="3175" b="2540"/>
-            <wp:docPr id="3" name="Рисунок 3"/>
+          <wp:inline distT="0" distB="0" distL="0" distR="0" wp14:anchorId="2FF624C7" wp14:editId="12AE38BF">
+            <wp:extent cx="5940425" cy="1634490"/>
+            <wp:effectExtent l="0" t="0" r="3175" b="3810"/>
+            <wp:docPr id="14" name="Рисунок 14"/>
             <wp:cNvGraphicFramePr>
               <a:graphicFrameLocks xmlns:a="http://schemas.openxmlformats.org/drawingml/2006/main" noChangeAspect="1"/>
             </wp:cNvGraphicFramePr>
@@ -158,7 +206,7 @@
                   <pic:spPr>
                     <a:xfrm>
                       <a:off x="0" y="0"/>
-                      <a:ext cx="5940425" cy="1483360"/>
+                      <a:ext cx="5940425" cy="1634490"/>
                     </a:xfrm>
                     <a:prstGeom prst="rect">
                       <a:avLst/>
@@ -170,23 +218,15 @@
           </wp:inline>
         </w:drawing>
       </w:r>
-    </w:p>
-    <w:p>
-      <w:pPr>
-        <w:rPr>
-          <w:lang w:val="en-US"/>
-        </w:rPr>
-      </w:pPr>
-      <w:r>
-        <w:rPr>
-          <w:noProof/>
+      <w:r>
+        <w:rPr>
           <w:lang w:val="en-US"/>
         </w:rPr>
         <w:drawing>
-          <wp:inline distT="0" distB="0" distL="0" distR="0" wp14:anchorId="7F7134E6" wp14:editId="0D780A5C">
-            <wp:extent cx="5940425" cy="1991995"/>
-            <wp:effectExtent l="0" t="0" r="3175" b="8255"/>
-            <wp:docPr id="4" name="Рисунок 4"/>
+          <wp:inline distT="0" distB="0" distL="0" distR="0" wp14:anchorId="280BEE4B" wp14:editId="0A0F4E78">
+            <wp:extent cx="5940425" cy="1815465"/>
+            <wp:effectExtent l="0" t="0" r="3175" b="0"/>
+            <wp:docPr id="15" name="Рисунок 15"/>
             <wp:cNvGraphicFramePr>
               <a:graphicFrameLocks xmlns:a="http://schemas.openxmlformats.org/drawingml/2006/main" noChangeAspect="1"/>
             </wp:cNvGraphicFramePr>
@@ -206,7 +246,7 @@
                   <pic:spPr>
                     <a:xfrm>
                       <a:off x="0" y="0"/>
-                      <a:ext cx="5940425" cy="1991995"/>
+                      <a:ext cx="5940425" cy="1815465"/>
                     </a:xfrm>
                     <a:prstGeom prst="rect">
                       <a:avLst/>
@@ -227,14 +267,14 @@
       </w:pPr>
       <w:r>
         <w:rPr>
-          <w:noProof/>
-          <w:lang w:val="en-US"/>
-        </w:rPr>
+          <w:lang w:val="en-US"/>
+        </w:rPr>
+        <w:lastRenderedPageBreak/>
         <w:drawing>
-          <wp:inline distT="0" distB="0" distL="0" distR="0" wp14:anchorId="49FF238E" wp14:editId="477FF059">
-            <wp:extent cx="5940425" cy="1718945"/>
-            <wp:effectExtent l="0" t="0" r="3175" b="0"/>
-            <wp:docPr id="5" name="Рисунок 5"/>
+          <wp:inline distT="0" distB="0" distL="0" distR="0" wp14:anchorId="0FFBA9E5" wp14:editId="6F737D06">
+            <wp:extent cx="5940425" cy="1884045"/>
+            <wp:effectExtent l="0" t="0" r="3175" b="1905"/>
+            <wp:docPr id="16" name="Рисунок 16"/>
             <wp:cNvGraphicFramePr>
               <a:graphicFrameLocks xmlns:a="http://schemas.openxmlformats.org/drawingml/2006/main" noChangeAspect="1"/>
             </wp:cNvGraphicFramePr>
@@ -254,7 +294,7 @@
                   <pic:spPr>
                     <a:xfrm>
                       <a:off x="0" y="0"/>
-                      <a:ext cx="5940425" cy="1718945"/>
+                      <a:ext cx="5940425" cy="1884045"/>
                     </a:xfrm>
                     <a:prstGeom prst="rect">
                       <a:avLst/>
@@ -266,24 +306,15 @@
           </wp:inline>
         </w:drawing>
       </w:r>
-    </w:p>
-    <w:p>
-      <w:pPr>
-        <w:rPr>
-          <w:lang w:val="en-US"/>
-        </w:rPr>
-      </w:pPr>
-      <w:r>
-        <w:rPr>
-          <w:noProof/>
-          <w:lang w:val="en-US"/>
-        </w:rPr>
-        <w:lastRenderedPageBreak/>
+      <w:r>
+        <w:rPr>
+          <w:lang w:val="en-US"/>
+        </w:rPr>
         <w:drawing>
-          <wp:inline distT="0" distB="0" distL="0" distR="0" wp14:anchorId="3E81C7B0" wp14:editId="2526DD42">
-            <wp:extent cx="5940425" cy="1757680"/>
+          <wp:inline distT="0" distB="0" distL="0" distR="0" wp14:anchorId="50BA788C" wp14:editId="6FC4A227">
+            <wp:extent cx="5940425" cy="3658235"/>
             <wp:effectExtent l="0" t="0" r="3175" b="0"/>
-            <wp:docPr id="6" name="Рисунок 6"/>
+            <wp:docPr id="17" name="Рисунок 17"/>
             <wp:cNvGraphicFramePr>
               <a:graphicFrameLocks xmlns:a="http://schemas.openxmlformats.org/drawingml/2006/main" noChangeAspect="1"/>
             </wp:cNvGraphicFramePr>
@@ -303,7 +334,7 @@
                   <pic:spPr>
                     <a:xfrm>
                       <a:off x="0" y="0"/>
-                      <a:ext cx="5940425" cy="1757680"/>
+                      <a:ext cx="5940425" cy="3658235"/>
                     </a:xfrm>
                     <a:prstGeom prst="rect">
                       <a:avLst/>
@@ -315,23 +346,15 @@
           </wp:inline>
         </w:drawing>
       </w:r>
-    </w:p>
-    <w:p>
-      <w:pPr>
-        <w:rPr>
-          <w:lang w:val="en-US"/>
-        </w:rPr>
-      </w:pPr>
-      <w:r>
-        <w:rPr>
-          <w:noProof/>
+      <w:r>
+        <w:rPr>
           <w:lang w:val="en-US"/>
         </w:rPr>
         <w:drawing>
-          <wp:inline distT="0" distB="0" distL="0" distR="0" wp14:anchorId="2F2558F6" wp14:editId="32E530C3">
-            <wp:extent cx="5940425" cy="1831340"/>
+          <wp:inline distT="0" distB="0" distL="0" distR="0" wp14:anchorId="40AFDFC7" wp14:editId="6940C372">
+            <wp:extent cx="5940425" cy="972185"/>
             <wp:effectExtent l="0" t="0" r="3175" b="0"/>
-            <wp:docPr id="12" name="Рисунок 12"/>
+            <wp:docPr id="18" name="Рисунок 18"/>
             <wp:cNvGraphicFramePr>
               <a:graphicFrameLocks xmlns:a="http://schemas.openxmlformats.org/drawingml/2006/main" noChangeAspect="1"/>
             </wp:cNvGraphicFramePr>
@@ -351,7 +374,7 @@
                   <pic:spPr>
                     <a:xfrm>
                       <a:off x="0" y="0"/>
-                      <a:ext cx="5940425" cy="1831340"/>
+                      <a:ext cx="5940425" cy="972185"/>
                     </a:xfrm>
                     <a:prstGeom prst="rect">
                       <a:avLst/>
@@ -363,254 +386,6 @@
           </wp:inline>
         </w:drawing>
       </w:r>
-    </w:p>
-    <w:p>
-      <w:pPr>
-        <w:rPr>
-          <w:lang w:val="en-US"/>
-        </w:rPr>
-      </w:pPr>
-      <w:r>
-        <w:rPr>
-          <w:noProof/>
-          <w:lang w:val="en-US"/>
-        </w:rPr>
-        <w:drawing>
-          <wp:inline distT="0" distB="0" distL="0" distR="0" wp14:anchorId="75A576A3" wp14:editId="5587EA6A">
-            <wp:extent cx="5940425" cy="1729740"/>
-            <wp:effectExtent l="0" t="0" r="3175" b="3810"/>
-            <wp:docPr id="7" name="Рисунок 7"/>
-            <wp:cNvGraphicFramePr>
-              <a:graphicFrameLocks xmlns:a="http://schemas.openxmlformats.org/drawingml/2006/main" noChangeAspect="1"/>
-            </wp:cNvGraphicFramePr>
-            <a:graphic xmlns:a="http://schemas.openxmlformats.org/drawingml/2006/main">
-              <a:graphicData uri="http://schemas.openxmlformats.org/drawingml/2006/picture">
-                <pic:pic xmlns:pic="http://schemas.openxmlformats.org/drawingml/2006/picture">
-                  <pic:nvPicPr>
-                    <pic:cNvPr id="1" name=""/>
-                    <pic:cNvPicPr/>
-                  </pic:nvPicPr>
-                  <pic:blipFill>
-                    <a:blip r:embed="rId11"/>
-                    <a:stretch>
-                      <a:fillRect/>
-                    </a:stretch>
-                  </pic:blipFill>
-                  <pic:spPr>
-                    <a:xfrm>
-                      <a:off x="0" y="0"/>
-                      <a:ext cx="5940425" cy="1729740"/>
-                    </a:xfrm>
-                    <a:prstGeom prst="rect">
-                      <a:avLst/>
-                    </a:prstGeom>
-                  </pic:spPr>
-                </pic:pic>
-              </a:graphicData>
-            </a:graphic>
-          </wp:inline>
-        </w:drawing>
-      </w:r>
-    </w:p>
-    <w:p>
-      <w:pPr>
-        <w:rPr>
-          <w:lang w:val="en-US"/>
-        </w:rPr>
-      </w:pPr>
-      <w:r>
-        <w:rPr>
-          <w:noProof/>
-          <w:lang w:val="en-US"/>
-        </w:rPr>
-        <w:drawing>
-          <wp:inline distT="0" distB="0" distL="0" distR="0" wp14:anchorId="361D189A" wp14:editId="39A44960">
-            <wp:extent cx="5940425" cy="1428115"/>
-            <wp:effectExtent l="0" t="0" r="3175" b="635"/>
-            <wp:docPr id="8" name="Рисунок 8"/>
-            <wp:cNvGraphicFramePr>
-              <a:graphicFrameLocks xmlns:a="http://schemas.openxmlformats.org/drawingml/2006/main" noChangeAspect="1"/>
-            </wp:cNvGraphicFramePr>
-            <a:graphic xmlns:a="http://schemas.openxmlformats.org/drawingml/2006/main">
-              <a:graphicData uri="http://schemas.openxmlformats.org/drawingml/2006/picture">
-                <pic:pic xmlns:pic="http://schemas.openxmlformats.org/drawingml/2006/picture">
-                  <pic:nvPicPr>
-                    <pic:cNvPr id="1" name=""/>
-                    <pic:cNvPicPr/>
-                  </pic:nvPicPr>
-                  <pic:blipFill>
-                    <a:blip r:embed="rId12"/>
-                    <a:stretch>
-                      <a:fillRect/>
-                    </a:stretch>
-                  </pic:blipFill>
-                  <pic:spPr>
-                    <a:xfrm>
-                      <a:off x="0" y="0"/>
-                      <a:ext cx="5940425" cy="1428115"/>
-                    </a:xfrm>
-                    <a:prstGeom prst="rect">
-                      <a:avLst/>
-                    </a:prstGeom>
-                  </pic:spPr>
-                </pic:pic>
-              </a:graphicData>
-            </a:graphic>
-          </wp:inline>
-        </w:drawing>
-      </w:r>
-    </w:p>
-    <w:p>
-      <w:pPr>
-        <w:rPr>
-          <w:lang w:val="en-US"/>
-        </w:rPr>
-      </w:pPr>
-      <w:r>
-        <w:rPr>
-          <w:noProof/>
-          <w:lang w:val="en-US"/>
-        </w:rPr>
-        <w:drawing>
-          <wp:inline distT="0" distB="0" distL="0" distR="0" wp14:anchorId="310ACAB4" wp14:editId="4722738F">
-            <wp:extent cx="5940425" cy="1764665"/>
-            <wp:effectExtent l="0" t="0" r="3175" b="6985"/>
-            <wp:docPr id="9" name="Рисунок 9"/>
-            <wp:cNvGraphicFramePr>
-              <a:graphicFrameLocks xmlns:a="http://schemas.openxmlformats.org/drawingml/2006/main" noChangeAspect="1"/>
-            </wp:cNvGraphicFramePr>
-            <a:graphic xmlns:a="http://schemas.openxmlformats.org/drawingml/2006/main">
-              <a:graphicData uri="http://schemas.openxmlformats.org/drawingml/2006/picture">
-                <pic:pic xmlns:pic="http://schemas.openxmlformats.org/drawingml/2006/picture">
-                  <pic:nvPicPr>
-                    <pic:cNvPr id="1" name=""/>
-                    <pic:cNvPicPr/>
-                  </pic:nvPicPr>
-                  <pic:blipFill>
-                    <a:blip r:embed="rId13"/>
-                    <a:stretch>
-                      <a:fillRect/>
-                    </a:stretch>
-                  </pic:blipFill>
-                  <pic:spPr>
-                    <a:xfrm>
-                      <a:off x="0" y="0"/>
-                      <a:ext cx="5940425" cy="1764665"/>
-                    </a:xfrm>
-                    <a:prstGeom prst="rect">
-                      <a:avLst/>
-                    </a:prstGeom>
-                  </pic:spPr>
-                </pic:pic>
-              </a:graphicData>
-            </a:graphic>
-          </wp:inline>
-        </w:drawing>
-      </w:r>
-    </w:p>
-    <w:p>
-      <w:pPr>
-        <w:rPr>
-          <w:lang w:val="en-US"/>
-        </w:rPr>
-      </w:pPr>
-      <w:r>
-        <w:rPr>
-          <w:noProof/>
-          <w:lang w:val="en-US"/>
-        </w:rPr>
-        <w:lastRenderedPageBreak/>
-        <w:drawing>
-          <wp:inline distT="0" distB="0" distL="0" distR="0" wp14:anchorId="4D81B414" wp14:editId="0D864EE2">
-            <wp:extent cx="5940425" cy="1857375"/>
-            <wp:effectExtent l="0" t="0" r="3175" b="9525"/>
-            <wp:docPr id="10" name="Рисунок 10"/>
-            <wp:cNvGraphicFramePr>
-              <a:graphicFrameLocks xmlns:a="http://schemas.openxmlformats.org/drawingml/2006/main" noChangeAspect="1"/>
-            </wp:cNvGraphicFramePr>
-            <a:graphic xmlns:a="http://schemas.openxmlformats.org/drawingml/2006/main">
-              <a:graphicData uri="http://schemas.openxmlformats.org/drawingml/2006/picture">
-                <pic:pic xmlns:pic="http://schemas.openxmlformats.org/drawingml/2006/picture">
-                  <pic:nvPicPr>
-                    <pic:cNvPr id="1" name=""/>
-                    <pic:cNvPicPr/>
-                  </pic:nvPicPr>
-                  <pic:blipFill>
-                    <a:blip r:embed="rId14"/>
-                    <a:stretch>
-                      <a:fillRect/>
-                    </a:stretch>
-                  </pic:blipFill>
-                  <pic:spPr>
-                    <a:xfrm>
-                      <a:off x="0" y="0"/>
-                      <a:ext cx="5940425" cy="1857375"/>
-                    </a:xfrm>
-                    <a:prstGeom prst="rect">
-                      <a:avLst/>
-                    </a:prstGeom>
-                  </pic:spPr>
-                </pic:pic>
-              </a:graphicData>
-            </a:graphic>
-          </wp:inline>
-        </w:drawing>
-      </w:r>
-    </w:p>
-    <w:p>
-      <w:pPr>
-        <w:rPr>
-          <w:lang w:val="en-US"/>
-        </w:rPr>
-      </w:pPr>
-      <w:r>
-        <w:rPr>
-          <w:noProof/>
-          <w:lang w:val="en-US"/>
-        </w:rPr>
-        <w:drawing>
-          <wp:inline distT="0" distB="0" distL="0" distR="0" wp14:anchorId="4FAD92AF" wp14:editId="012C0E7E">
-            <wp:extent cx="5940425" cy="1337945"/>
-            <wp:effectExtent l="0" t="0" r="3175" b="0"/>
-            <wp:docPr id="11" name="Рисунок 11"/>
-            <wp:cNvGraphicFramePr>
-              <a:graphicFrameLocks xmlns:a="http://schemas.openxmlformats.org/drawingml/2006/main" noChangeAspect="1"/>
-            </wp:cNvGraphicFramePr>
-            <a:graphic xmlns:a="http://schemas.openxmlformats.org/drawingml/2006/main">
-              <a:graphicData uri="http://schemas.openxmlformats.org/drawingml/2006/picture">
-                <pic:pic xmlns:pic="http://schemas.openxmlformats.org/drawingml/2006/picture">
-                  <pic:nvPicPr>
-                    <pic:cNvPr id="1" name=""/>
-                    <pic:cNvPicPr/>
-                  </pic:nvPicPr>
-                  <pic:blipFill>
-                    <a:blip r:embed="rId15"/>
-                    <a:stretch>
-                      <a:fillRect/>
-                    </a:stretch>
-                  </pic:blipFill>
-                  <pic:spPr>
-                    <a:xfrm>
-                      <a:off x="0" y="0"/>
-                      <a:ext cx="5940425" cy="1337945"/>
-                    </a:xfrm>
-                    <a:prstGeom prst="rect">
-                      <a:avLst/>
-                    </a:prstGeom>
-                  </pic:spPr>
-                </pic:pic>
-              </a:graphicData>
-            </a:graphic>
-          </wp:inline>
-        </w:drawing>
-      </w:r>
-    </w:p>
-    <w:p>
-      <w:pPr>
-        <w:rPr>
-          <w:lang w:val="en-US"/>
-        </w:rPr>
-      </w:pPr>
     </w:p>
     <w:p>
       <w:pPr>

</xml_diff>